<commit_message>
Tighten thesis source purity and formal blockers
</commit_message>
<xml_diff>
--- a/output/docx/biometrics-vkr/thesis-draft.docx
+++ b/output/docx/biometrics-vkr/thesis-draft.docx
@@ -3771,7 +3771,7 @@
         </w:numPr>
       </w:pPr>
       <w:r>
-        <w:t xml:space="preserve">Конституция Российской Федерации (принята всенародным голосованием 12.12.1993; с изм., одобренными в ходе общероссийского голосования 01.07.2020). URL: https://www.consultant.ru/document/cons_doc_LAW_28399/ (дата обращения: 17.04.2026).</w:t>
+        <w:t xml:space="preserve">Конституция Российской Федерации (принята всенародным голосованием 12.12.1993; с изм., одобренными в ходе общероссийского голосования 01.07.2020). URL: https://pravo.gov.ru/proxy/ips/?docbody=&amp;vkart=card&amp;nd=102027595 (дата обращения: 17.04.2026).</w:t>
       </w:r>
     </w:p>
     <w:p>
@@ -3795,7 +3795,7 @@
         <w:t xml:space="preserve"> </w:t>
       </w:r>
       <w:r>
-        <w:t xml:space="preserve">(ред. от 24.06.2025). URL: https://www.consultant.ru/document/cons_doc_LAW_61801/ (дата обращения: 17.04.2026).</w:t>
+        <w:t xml:space="preserve">(ред. от 24.06.2025). URL: https://pravo.gov.ru/proxy/ips/?docbody=&amp;link_id=0&amp;nd=102108261&amp;intelsearch=&amp;firstDoc=1 (дата обращения: 17.04.2026).</w:t>
       </w:r>
     </w:p>
     <w:p>
@@ -3819,7 +3819,7 @@
         <w:t xml:space="preserve"> </w:t>
       </w:r>
       <w:r>
-        <w:t xml:space="preserve">(ред. от 28.12.2024). URL: https://www.consultant.ru/document/cons_doc_LAW_436110/ (дата обращения: 17.04.2026).</w:t>
+        <w:t xml:space="preserve">(ред. от 28.12.2024). Официальное опубликование: N 0001202212290024; действующая редакция перепроверена по официальному интернет-порталу правовой информации на 17.04.2026. URL: https://publication.pravo.gov.ru/Document/View/0001202212290024 (дата обращения: 17.04.2026).</w:t>
       </w:r>
     </w:p>
     <w:p>
@@ -5006,7 +5006,7 @@
         <w:t xml:space="preserve"> </w:t>
       </w:r>
       <w:r>
-        <w:t xml:space="preserve">Конституция Российской Федерации (принята всенародным голосованием 12.12.1993; с изм., одобренными в ходе общероссийского голосования 01.07.2020). URL: https://www.consultant.ru/document/cons_doc_LAW_28399/; Федеральный закон от 27.07.2006 N 152-ФЗ</w:t>
+        <w:t xml:space="preserve">Конституция Российской Федерации (принята всенародным голосованием 12.12.1993; с изм., одобренными в ходе общероссийского голосования 01.07.2020). URL: https://pravo.gov.ru/proxy/ips/?docbody=&amp;vkart=card&amp;nd=102027595; Федеральный закон от 27.07.2006 N 152-ФЗ</w:t>
       </w:r>
       <w:r>
         <w:t xml:space="preserve"> </w:t>
@@ -5018,7 +5018,7 @@
         <w:t xml:space="preserve"> </w:t>
       </w:r>
       <w:r>
-        <w:t xml:space="preserve">(ред. от 24.06.2025). URL: https://www.consultant.ru/document/cons_doc_LAW_61801/; Федеральный закон от 29.12.2022 N 572-ФЗ</w:t>
+        <w:t xml:space="preserve">(ред. от 24.06.2025). URL: https://pravo.gov.ru/proxy/ips/?docbody=&amp;link_id=0&amp;nd=102108261&amp;intelsearch=&amp;firstDoc=1; Федеральный закон от 29.12.2022 N 572-ФЗ</w:t>
       </w:r>
       <w:r>
         <w:t xml:space="preserve"> </w:t>
@@ -5030,7 +5030,7 @@
         <w:t xml:space="preserve"> </w:t>
       </w:r>
       <w:r>
-        <w:t xml:space="preserve">(ред. от 28.12.2024). URL: https://www.consultant.ru/document/cons_doc_LAW_436110/; Постановление Конституционного Суда РФ от 25.05.2021 N 22-П. URL: https://publication.pravo.gov.ru/Document/View/0001202105280003;</w:t>
+        <w:t xml:space="preserve">(ред. от 28.12.2024). Официальное опубликование: N 0001202212290024. URL: https://publication.pravo.gov.ru/Document/View/0001202212290024; Постановление Конституционного Суда РФ от 25.05.2021 N 22-П. URL: https://publication.pravo.gov.ru/Document/View/0001202105280003;</w:t>
       </w:r>
       <w:r>
         <w:t xml:space="preserve"> </w:t>
@@ -5110,7 +5110,7 @@
         <w:t xml:space="preserve"> </w:t>
       </w:r>
       <w:r>
-        <w:t xml:space="preserve">Конституция Российской Федерации (принята всенародным голосованием 12.12.1993; с изм., одобренными в ходе общероссийского голосования 01.07.2020). Ст. 23, 24, 55. URL: https://www.consultant.ru/document/cons_doc_LAW_28399/ (дата обращения: 16.04.2026).</w:t>
+        <w:t xml:space="preserve">Конституция Российской Федерации (принята всенародным голосованием 12.12.1993; с изм., одобренными в ходе общероссийского голосования 01.07.2020). Ст. 23, 24, 55. URL: https://pravo.gov.ru/proxy/ips/?docbody=&amp;vkart=card&amp;nd=102027595 (дата обращения: 16.04.2026).</w:t>
       </w:r>
     </w:p>
   </w:footnote>
@@ -5129,7 +5129,7 @@
         <w:t xml:space="preserve"> </w:t>
       </w:r>
       <w:r>
-        <w:t xml:space="preserve">Конституция Российской Федерации. Ст. 23. URL: https://www.consultant.ru/document/cons_doc_LAW_28399/ (дата обращения: 16.04.2026); Постановление Конституционного Суда РФ от 25.05.2021 N 22-П</w:t>
+        <w:t xml:space="preserve">Конституция Российской Федерации. Ст. 23. URL: https://pravo.gov.ru/proxy/ips/?docbody=&amp;vkart=card&amp;nd=102027595 (дата обращения: 16.04.2026); Постановление Конституционного Суда РФ от 25.05.2021 N 22-П</w:t>
       </w:r>
       <w:r>
         <w:t xml:space="preserve"> </w:t>
@@ -5138,7 +5138,7 @@
         <w:t xml:space="preserve">“По делу о проверке конституционности пункта 8 части 1 статьи 6 Федерального закона «О персональных данных» в связи с жалобой общества с ограниченной ответственностью «МедРейтинг»”</w:t>
       </w:r>
       <w:r>
-        <w:t xml:space="preserve">. П. 2, 2.1. URL: https://www.consultant.ru/document/cons_doc_LAW_385041/ (дата обращения: 16.04.2026).</w:t>
+        <w:t xml:space="preserve">. П. 2, 2.1. URL: https://publication.pravo.gov.ru/Document/View/0001202105280003 (дата обращения: 16.04.2026).</w:t>
       </w:r>
     </w:p>
   </w:footnote>
@@ -5157,7 +5157,7 @@
         <w:t xml:space="preserve"> </w:t>
       </w:r>
       <w:r>
-        <w:t xml:space="preserve">Конституция Российской Федерации. Ст. 23 ч. 2. URL: https://www.consultant.ru/document/cons_doc_LAW_28399/ (дата обращения: 16.04.2026).</w:t>
+        <w:t xml:space="preserve">Конституция Российской Федерации. Ст. 23 ч. 2. URL: https://pravo.gov.ru/proxy/ips/?docbody=&amp;vkart=card&amp;nd=102027595 (дата обращения: 16.04.2026).</w:t>
       </w:r>
     </w:p>
   </w:footnote>
@@ -5176,7 +5176,7 @@
         <w:t xml:space="preserve"> </w:t>
       </w:r>
       <w:r>
-        <w:t xml:space="preserve">Конституция Российской Федерации. Ст. 24. URL: https://www.consultant.ru/document/cons_doc_LAW_28399/ (дата обращения: 16.04.2026).</w:t>
+        <w:t xml:space="preserve">Конституция Российской Федерации. Ст. 24. URL: https://pravo.gov.ru/proxy/ips/?docbody=&amp;vkart=card&amp;nd=102027595 (дата обращения: 16.04.2026).</w:t>
       </w:r>
     </w:p>
   </w:footnote>
@@ -5195,7 +5195,7 @@
         <w:t xml:space="preserve"> </w:t>
       </w:r>
       <w:r>
-        <w:t xml:space="preserve">Конституция Российской Федерации. Ст. 24. URL: https://www.consultant.ru/document/cons_doc_LAW_28399/ (дата обращения: 16.04.2026).</w:t>
+        <w:t xml:space="preserve">Конституция Российской Федерации. Ст. 24. URL: https://pravo.gov.ru/proxy/ips/?docbody=&amp;vkart=card&amp;nd=102027595 (дата обращения: 16.04.2026).</w:t>
       </w:r>
     </w:p>
   </w:footnote>
@@ -5214,7 +5214,7 @@
         <w:t xml:space="preserve"> </w:t>
       </w:r>
       <w:r>
-        <w:t xml:space="preserve">Конституция Российской Федерации. Ст. 55. URL: https://www.consultant.ru/document/cons_doc_LAW_28399/ (дата обращения: 16.04.2026).</w:t>
+        <w:t xml:space="preserve">Конституция Российской Федерации. Ст. 55. URL: https://pravo.gov.ru/proxy/ips/?docbody=&amp;vkart=card&amp;nd=102027595 (дата обращения: 16.04.2026).</w:t>
       </w:r>
     </w:p>
   </w:footnote>
@@ -5245,7 +5245,7 @@
         <w:t xml:space="preserve"> </w:t>
       </w:r>
       <w:r>
-        <w:t xml:space="preserve">(ред. от 24.06.2025). Ст. 10.1; ст. 11, ч. 1-3. В ч. 2 ст. 11 без согласия субъекта допускается обработка биометрических персональных данных лишь в прямо перечисленных законом случаях; действующая редакция учитывает, в частности, изменения, внесенные Федеральными законами от 28.12.2024 N 519-ФЗ и от 23.05.2025 N 121-ФЗ. URL: https://www.consultant.ru/document/cons_doc_LAW_61801/; https://www.consultant.ru/document/cons_doc_LAW_61801/7336c78762a98b5f4f698b8c3800dca1111acc16/ (дата обращения: 16.04.2026).</w:t>
+        <w:t xml:space="preserve">(ред. от 24.06.2025). Ст. 10.1; ст. 11, ч. 1-3. В ч. 2 ст. 11 без согласия субъекта допускается обработка биометрических персональных данных лишь в прямо перечисленных законом случаях; действующая редакция учитывает, в частности, изменения, внесенные Федеральными законами от 28.12.2024 N 519-ФЗ и от 23.05.2025 N 121-ФЗ. URL: https://pravo.gov.ru/proxy/ips/?docbody=&amp;link_id=0&amp;nd=102108261&amp;intelsearch=&amp;firstDoc=1 (дата обращения: 16.04.2026).</w:t>
       </w:r>
     </w:p>
   </w:footnote>
@@ -5276,7 +5276,7 @@
         <w:t xml:space="preserve"> </w:t>
       </w:r>
       <w:r>
-        <w:t xml:space="preserve">(ред. от 28.12.2024). Ст. 1, 3. Действующая редакция сформирована с учетом Федеральных законов от 08.08.2024 N 303-ФЗ, от 26.12.2024 N 494-ФЗ и от 28.12.2024 N 522-ФЗ. URL: https://www.consultant.ru/document/cons_doc_LAW_436110/; https://www.consultant.ru/document/cons_doc_LAW_436110/15f0efd3c8311b53608abd85f9c02157e1457f55/ (дата обращения: 16.04.2026).</w:t>
+        <w:t xml:space="preserve">(ред. от 28.12.2024). Ст. 1, 3. Официальное опубликование: N 0001202212290024; действующая редакция перепроверена по официальному интернет-порталу правовой информации на 16.04.2026. URL: https://publication.pravo.gov.ru/Document/View/0001202212290024 (дата обращения: 16.04.2026).</w:t>
       </w:r>
     </w:p>
   </w:footnote>
@@ -5304,7 +5304,7 @@
         <w:t xml:space="preserve">“По делу о проверке конституционности пункта 8 части 1 статьи 6 Федерального закона «О персональных данных» в связи с жалобой общества с ограниченной ответственностью «МедРейтинг»”</w:t>
       </w:r>
       <w:r>
-        <w:t xml:space="preserve">. П. 2, 2.1. URL: https://www.consultant.ru/document/cons_doc_LAW_385041/ (дата обращения: 16.04.2026).</w:t>
+        <w:t xml:space="preserve">. П. 2, 2.1. URL: https://publication.pravo.gov.ru/Document/View/0001202105280003 (дата обращения: 16.04.2026).</w:t>
       </w:r>
     </w:p>
   </w:footnote>
@@ -5332,7 +5332,7 @@
         <w:t xml:space="preserve">“По делу о проверке конституционности пункта 8 части 1 статьи 6 Федерального закона «О персональных данных» в связи с жалобой общества с ограниченной ответственностью «МедРейтинг»”</w:t>
       </w:r>
       <w:r>
-        <w:t xml:space="preserve">. П. 3, 3.1, 4, резолютивная часть. URL: https://www.consultant.ru/document/cons_doc_LAW_385041/ (дата обращения: 16.04.2026).</w:t>
+        <w:t xml:space="preserve">. П. 3, 3.1, 4, резолютивная часть. URL: https://publication.pravo.gov.ru/Document/View/0001202105280003 (дата обращения: 16.04.2026).</w:t>
       </w:r>
     </w:p>
   </w:footnote>
@@ -5360,7 +5360,7 @@
         <w:t xml:space="preserve">“По делу о проверке конституционности пункта 8 части 1 статьи 6 Федерального закона «О персональных данных» в связи с жалобой общества с ограниченной ответственностью «МедРейтинг»”</w:t>
       </w:r>
       <w:r>
-        <w:t xml:space="preserve">. П. 2, 2.1. URL: https://www.consultant.ru/document/cons_doc_LAW_385041/ (дата обращения: 16.04.2026); Постановление Конституционного Суда РФ от 09.07.2013 N 18-П</w:t>
+        <w:t xml:space="preserve">. П. 2, 2.1. URL: https://publication.pravo.gov.ru/Document/View/0001202105280003 (дата обращения: 16.04.2026); Постановление Конституционного Суда РФ от 09.07.2013 N 18-П</w:t>
       </w:r>
       <w:r>
         <w:t xml:space="preserve"> </w:t>
@@ -5474,7 +5474,7 @@
         <w:t xml:space="preserve">“О персональных данных”</w:t>
       </w:r>
       <w:r>
-        <w:t xml:space="preserve">. Ст. 11, ч. 1. URL: https://www.consultant.ru/document/cons_doc_LAW_61801/7336c78762a98b5f4f698b8c3800dca1111acc16/ (дата обращения: 16.04.2026).</w:t>
+        <w:t xml:space="preserve">. Ст. 11, ч. 1. URL: https://pravo.gov.ru/proxy/ips/?docbody=&amp;link_id=0&amp;nd=102108261&amp;intelsearch=&amp;firstDoc=1 (дата обращения: 16.04.2026).</w:t>
       </w:r>
     </w:p>
   </w:footnote>
@@ -5607,7 +5607,7 @@
         <w:t xml:space="preserve">“О персональных данных”</w:t>
       </w:r>
       <w:r>
-        <w:t xml:space="preserve">. Ст. 11, ч. 3. URL: https://www.consultant.ru/document/cons_doc_LAW_61801/7336c78762a98b5f4f698b8c3800dca1111acc16/ (дата обращения: 16.04.2026).</w:t>
+        <w:t xml:space="preserve">. Ст. 11, ч. 3. URL: https://pravo.gov.ru/proxy/ips/?docbody=&amp;link_id=0&amp;nd=102108261&amp;intelsearch=&amp;firstDoc=1 (дата обращения: 16.04.2026).</w:t>
       </w:r>
     </w:p>
   </w:footnote>
@@ -5667,7 +5667,7 @@
         <w:t xml:space="preserve"> </w:t>
       </w:r>
       <w:r>
-        <w:t xml:space="preserve">Федеральный закон от 29.12.2022 N 572-ФЗ. Ст. 3, ч. 11-16. URL: https://www.consultant.ru/document/cons_doc_LAW_436110/15f0efd3c8311b53608abd85f9c02157e1457f55/ (дата обращения: 16.04.2026).</w:t>
+        <w:t xml:space="preserve">Федеральный закон от 29.12.2022 N 572-ФЗ. Ст. 3, ч. 11-16. Официальное опубликование: N 0001202212290024. URL: https://publication.pravo.gov.ru/Document/View/0001202212290024 (дата обращения: 16.04.2026).</w:t>
       </w:r>
     </w:p>
   </w:footnote>
@@ -5686,7 +5686,7 @@
         <w:t xml:space="preserve"> </w:t>
       </w:r>
       <w:r>
-        <w:t xml:space="preserve">Федеральный закон от 29.12.2022 N 572-ФЗ. Ст. 15. URL: https://www.consultant.ru/document/cons_doc_LAW_436110/b599780118c89e6e1fba4fb8a98aa3e77fb72fcc/ (дата обращения: 16.04.2026).</w:t>
+        <w:t xml:space="preserve">Федеральный закон от 29.12.2022 N 572-ФЗ. Ст. 15. Официальное опубликование: N 0001202212290024. URL: https://publication.pravo.gov.ru/Document/View/0001202212290024 (дата обращения: 16.04.2026).</w:t>
       </w:r>
     </w:p>
   </w:footnote>
@@ -5717,7 +5717,7 @@
         <w:t xml:space="preserve"> </w:t>
       </w:r>
       <w:r>
-        <w:t xml:space="preserve">URL: https://www.consultant.ru/document/cons_doc_LAW_473908/ (дата обращения: 16.04.2026).</w:t>
+        <w:t xml:space="preserve">URL: https://publication.pravo.gov.ru/document/0001202404050032 (дата обращения: 16.04.2026).</w:t>
       </w:r>
     </w:p>
   </w:footnote>
@@ -5736,7 +5736,7 @@
         <w:t xml:space="preserve"> </w:t>
       </w:r>
       <w:r>
-        <w:t xml:space="preserve">Федеральный закон от 27.07.2006 N 152-ФЗ. Ст. 10, 10.1, 11 (ред. от 24.06.2025). URL: https://www.consultant.ru/document/cons_doc_LAW_61801/; ст. 10: https://www.consultant.ru/document/cons_doc_LAW_61801/26edb2934b899bf9c74c3a8f7e574651c6565e6d/ (дата обращения: 16.04.2026).</w:t>
+        <w:t xml:space="preserve">Федеральный закон от 27.07.2006 N 152-ФЗ. Ст. 10, 10.1, 11 (ред. от 24.06.2025). URL: https://pravo.gov.ru/proxy/ips/?docbody=&amp;link_id=0&amp;nd=102108261&amp;intelsearch=&amp;firstDoc=1 (дата обращения: 16.04.2026).</w:t>
       </w:r>
     </w:p>
   </w:footnote>
@@ -5774,7 +5774,7 @@
         <w:t xml:space="preserve"> </w:t>
       </w:r>
       <w:r>
-        <w:t xml:space="preserve">Федеральный закон от 29.12.2022 N 572-ФЗ. Ст. 3, ч. 8. URL: https://www.consultant.ru/document/cons_doc_LAW_436110/15f0efd3c8311b53608abd85f9c02157e1457f55/ (дата обращения: 16.04.2026); Regulation (EU) 2016/679 (GDPR). Art. 4(13), 4(14). URL: https://eur-lex.europa.eu/eli/reg/2016/679/oj (дата обращения: 16.04.2026).</w:t>
+        <w:t xml:space="preserve">Федеральный закон от 29.12.2022 N 572-ФЗ. Ст. 3, ч. 8. Официальное опубликование: N 0001202212290024. URL: https://publication.pravo.gov.ru/Document/View/0001202212290024 (дата обращения: 16.04.2026); Regulation (EU) 2016/679 (GDPR). Art. 4(13), 4(14). URL: https://eur-lex.europa.eu/eli/reg/2016/679/oj (дата обращения: 16.04.2026).</w:t>
       </w:r>
     </w:p>
   </w:footnote>
@@ -5805,7 +5805,7 @@
         <w:t xml:space="preserve"> </w:t>
       </w:r>
       <w:r>
-        <w:t xml:space="preserve">(ред. от 28.12.2024). Ст. 2, 3, 4, 9, 10. URL: https://www.consultant.ru/document/cons_doc_LAW_436110/ (дата обращения: 16.04.2026).</w:t>
+        <w:t xml:space="preserve">(ред. от 28.12.2024). Ст. 2, 3, 4, 9, 10. Официальное опубликование: N 0001202212290024; действующая редакция перепроверена по официальному интернет-порталу правовой информации на 16.04.2026. URL: https://publication.pravo.gov.ru/Document/View/0001202212290024 (дата обращения: 16.04.2026).</w:t>
       </w:r>
     </w:p>
   </w:footnote>
@@ -5881,7 +5881,7 @@
         <w:t xml:space="preserve"> </w:t>
       </w:r>
       <w:r>
-        <w:t xml:space="preserve">(ред. от 28.12.2024). Ст. 2, 3, 4, 9, 10. URL: https://www.consultant.ru/document/cons_doc_LAW_436110/ (дата обращения: 16.04.2026).</w:t>
+        <w:t xml:space="preserve">(ред. от 28.12.2024). Ст. 2, 3, 4, 9, 10. Официальное опубликование: N 0001202212290024; действующая редакция перепроверена по официальному интернет-порталу правовой информации на 16.04.2026. URL: https://publication.pravo.gov.ru/Document/View/0001202212290024 (дата обращения: 16.04.2026).</w:t>
       </w:r>
     </w:p>
   </w:footnote>
@@ -6271,7 +6271,7 @@
         <w:t xml:space="preserve"> </w:t>
       </w:r>
       <w:r>
-        <w:t xml:space="preserve">Федеральный закон от 29.12.2022 N 572-ФЗ. Ст. 3, ч. 11-13, 16-18. URL: https://www.consultant.ru/document/cons_doc_LAW_436110/15f0efd3c8311b53608abd85f9c02157e1457f55/ (дата обращения: 16.04.2026); Постановление Конституционного Суда РФ от 25.05.2021 N 22-П</w:t>
+        <w:t xml:space="preserve">Федеральный закон от 29.12.2022 N 572-ФЗ. Ст. 3, ч. 11-13, 16-18. Официальное опубликование: N 0001202212290024. URL: https://publication.pravo.gov.ru/Document/View/0001202212290024 (дата обращения: 16.04.2026); Постановление Конституционного Суда РФ от 25.05.2021 N 22-П</w:t>
       </w:r>
       <w:r>
         <w:t xml:space="preserve"> </w:t>
@@ -6280,7 +6280,7 @@
         <w:t xml:space="preserve">“По делу о проверке конституционности пункта 8 части 1 статьи 6 Федерального закона «О персональных данных» в связи с жалобой общества с ограниченной ответственностью «МедРейтинг»”</w:t>
       </w:r>
       <w:r>
-        <w:t xml:space="preserve">. П. 2-4. URL: https://www.consultant.ru/document/cons_doc_LAW_385041/ (дата обращения: 16.04.2026).</w:t>
+        <w:t xml:space="preserve">. П. 2-4. URL: https://publication.pravo.gov.ru/Document/View/0001202105280003 (дата обращения: 16.04.2026).</w:t>
       </w:r>
     </w:p>
   </w:footnote>
@@ -6436,7 +6436,7 @@
         <w:t xml:space="preserve"> </w:t>
       </w:r>
       <w:r>
-        <w:t xml:space="preserve">(ред. от 24.06.2025). URL: https://www.consultant.ru/document/cons_doc_LAW_61801/; Федеральный закон от 29.12.2022 N 572-ФЗ</w:t>
+        <w:t xml:space="preserve">(ред. от 24.06.2025). URL: https://pravo.gov.ru/proxy/ips/?docbody=&amp;link_id=0&amp;nd=102108261&amp;intelsearch=&amp;firstDoc=1; Федеральный закон от 29.12.2022 N 572-ФЗ</w:t>
       </w:r>
       <w:r>
         <w:t xml:space="preserve"> </w:t>
@@ -6448,7 +6448,7 @@
         <w:t xml:space="preserve"> </w:t>
       </w:r>
       <w:r>
-        <w:t xml:space="preserve">(ред. от 28.12.2024). URL: https://www.consultant.ru/document/cons_doc_LAW_436110/ (дата обращения: 16.04.2026).</w:t>
+        <w:t xml:space="preserve">(ред. от 28.12.2024). Официальное опубликование: N 0001202212290024. URL: https://publication.pravo.gov.ru/Document/View/0001202212290024 (дата обращения: 16.04.2026).</w:t>
       </w:r>
     </w:p>
   </w:footnote>
@@ -6479,7 +6479,7 @@
         <w:t xml:space="preserve"> </w:t>
       </w:r>
       <w:r>
-        <w:t xml:space="preserve">(ред. от 24.06.2025). Ст. 2, ст. 5. URL: https://www.consultant.ru/document/cons_doc_LAW_61801/; https://www.consultant.ru/document/cons_doc_LAW_61801/96fbc469f91f57235cc842a85e0516a99f23dc85/ (дата обращения: 16.04.2026).</w:t>
+        <w:t xml:space="preserve">(ред. от 24.06.2025). Ст. 2, ст. 5. URL: https://pravo.gov.ru/proxy/ips/?docbody=&amp;link_id=0&amp;nd=102108261&amp;intelsearch=&amp;firstDoc=1 (дата обращения: 16.04.2026).</w:t>
       </w:r>
     </w:p>
   </w:footnote>
@@ -6507,7 +6507,7 @@
         <w:t xml:space="preserve">“О персональных данных”</w:t>
       </w:r>
       <w:r>
-        <w:t xml:space="preserve">. Ст. 9 (в ред. от 24.06.2025). URL: https://www.consultant.ru/document/cons_doc_LAW_61801/6c94959bc017ac80140621762d2ac59f6006b08c/ (дата обращения: 16.04.2026).</w:t>
+        <w:t xml:space="preserve">. Ст. 9 (в ред. от 24.06.2025). URL: https://pravo.gov.ru/proxy/ips/?docbody=&amp;link_id=0&amp;nd=102108261&amp;intelsearch=&amp;firstDoc=1 (дата обращения: 16.04.2026).</w:t>
       </w:r>
     </w:p>
   </w:footnote>
@@ -6535,7 +6535,7 @@
         <w:t xml:space="preserve">“О персональных данных”</w:t>
       </w:r>
       <w:r>
-        <w:t xml:space="preserve">. Ст. 11, ч. 1-3. URL: https://www.consultant.ru/document/cons_doc_LAW_61801/7336c78762a98b5f4f698b8c3800dca1111acc16/ (дата обращения: 16.04.2026).</w:t>
+        <w:t xml:space="preserve">. Ст. 11, ч. 1-3. URL: https://pravo.gov.ru/proxy/ips/?docbody=&amp;link_id=0&amp;nd=102108261&amp;intelsearch=&amp;firstDoc=1 (дата обращения: 16.04.2026).</w:t>
       </w:r>
     </w:p>
   </w:footnote>
@@ -6554,7 +6554,7 @@
         <w:t xml:space="preserve"> </w:t>
       </w:r>
       <w:r>
-        <w:t xml:space="preserve">Федеральный закон от 29.12.2022 N 572-ФЗ. Ст. 2, п. 4; ст. 8, ч. 1. URL: https://www.consultant.ru/document/cons_doc_LAW_436110/c5051782233acca771e9adb35b47d3fb82c9ff1c/; https://www.consultant.ru/document/cons_doc_LAW_436110/3a108d4b8ab193b90666a1cc410b2c5a7b6064ed/ (дата обращения: 16.04.2026).</w:t>
+        <w:t xml:space="preserve">Федеральный закон от 29.12.2022 N 572-ФЗ. Ст. 2, п. 4; ст. 8, ч. 1. Официальное опубликование: N 0001202212290024. URL: https://publication.pravo.gov.ru/Document/View/0001202212290024 (дата обращения: 16.04.2026).</w:t>
       </w:r>
     </w:p>
   </w:footnote>
@@ -6573,7 +6573,7 @@
         <w:t xml:space="preserve"> </w:t>
       </w:r>
       <w:r>
-        <w:t xml:space="preserve">Федеральный закон от 29.12.2022 N 572-ФЗ. Ст. 3, ч. 1-3. URL: https://www.consultant.ru/document/cons_doc_LAW_436110/15f0efd3c8311b53608abd85f9c02157e1457f55/ (дата обращения: 16.04.2026).</w:t>
+        <w:t xml:space="preserve">Федеральный закон от 29.12.2022 N 572-ФЗ. Ст. 3, ч. 1-3. Официальное опубликование: N 0001202212290024. URL: https://publication.pravo.gov.ru/Document/View/0001202212290024 (дата обращения: 16.04.2026).</w:t>
       </w:r>
     </w:p>
   </w:footnote>
@@ -6592,7 +6592,7 @@
         <w:t xml:space="preserve"> </w:t>
       </w:r>
       <w:r>
-        <w:t xml:space="preserve">Федеральный закон от 29.12.2022 N 572-ФЗ. Ст. 3, ч. 11-13. URL: https://www.consultant.ru/document/cons_doc_LAW_436110/15f0efd3c8311b53608abd85f9c02157e1457f55/ (дата обращения: 16.04.2026).</w:t>
+        <w:t xml:space="preserve">Федеральный закон от 29.12.2022 N 572-ФЗ. Ст. 3, ч. 11-13. Официальное опубликование: N 0001202212290024. URL: https://publication.pravo.gov.ru/Document/View/0001202212290024 (дата обращения: 16.04.2026).</w:t>
       </w:r>
     </w:p>
   </w:footnote>
@@ -6611,7 +6611,7 @@
         <w:t xml:space="preserve"> </w:t>
       </w:r>
       <w:r>
-        <w:t xml:space="preserve">Федеральный закон от 29.12.2022 N 572-ФЗ. Ст. 3, ч. 14-18. URL: https://www.consultant.ru/document/cons_doc_LAW_436110/15f0efd3c8311b53608abd85f9c02157e1457f55/ (дата обращения: 16.04.2026).</w:t>
+        <w:t xml:space="preserve">Федеральный закон от 29.12.2022 N 572-ФЗ. Ст. 3, ч. 14-18. Официальное опубликование: N 0001202212290024. URL: https://publication.pravo.gov.ru/Document/View/0001202212290024 (дата обращения: 16.04.2026).</w:t>
       </w:r>
     </w:p>
   </w:footnote>
@@ -6630,7 +6630,7 @@
         <w:t xml:space="preserve"> </w:t>
       </w:r>
       <w:r>
-        <w:t xml:space="preserve">Федеральный закон от 29.12.2022 N 572-ФЗ. Ст. 3, ч. 8. URL: https://www.consultant.ru/document/cons_doc_LAW_436110/15f0efd3c8311b53608abd85f9c02157e1457f55/ (дата обращения: 16.04.2026).</w:t>
+        <w:t xml:space="preserve">Федеральный закон от 29.12.2022 N 572-ФЗ. Ст. 3, ч. 8. Официальное опубликование: N 0001202212290024. URL: https://publication.pravo.gov.ru/Document/View/0001202212290024 (дата обращения: 16.04.2026).</w:t>
       </w:r>
     </w:p>
   </w:footnote>
@@ -6649,7 +6649,7 @@
         <w:t xml:space="preserve"> </w:t>
       </w:r>
       <w:r>
-        <w:t xml:space="preserve">Федеральный закон от 29.12.2022 N 572-ФЗ. Ст. 4, ч. 1-13; ст. 9, ч. 3-5; ст. 10, ч. 1-6. URL: https://www.consultant.ru/document/cons_doc_LAW_436110/10aee05e12277c35818b46632ac3c9dd2d327657/; https://www.consultant.ru/document/cons_doc_LAW_436110/eb49e4b6b3961c97b3a6a669352f5e911234ccf1/; https://www.consultant.ru/document/cons_doc_LAW_436110/f3008796e35445a5adad9236c1a058645dc1fc4a/ (дата обращения: 16.04.2026).</w:t>
+        <w:t xml:space="preserve">Федеральный закон от 29.12.2022 N 572-ФЗ. Ст. 4, ч. 1-13; ст. 9, ч. 3-5; ст. 10, ч. 1-6. Официальное опубликование: N 0001202212290024. URL: https://publication.pravo.gov.ru/Document/View/0001202212290024 (дата обращения: 16.04.2026).</w:t>
       </w:r>
     </w:p>
   </w:footnote>
@@ -6668,7 +6668,7 @@
         <w:t xml:space="preserve"> </w:t>
       </w:r>
       <w:r>
-        <w:t xml:space="preserve">Федеральный закон от 29.12.2022 N 572-ФЗ. Ст. 4, ч. 2-5; ст. 9, ч. 3; ст. 10, ч. 2-4; ст. 26. URL: https://www.consultant.ru/document/cons_doc_LAW_436110/10aee05e12277c35818b46632ac3c9dd2d327657/; https://www.consultant.ru/document/cons_doc_LAW_436110/eb49e4b6b3961c97b3a6a669352f5e911234ccf1/; https://www.consultant.ru/document/cons_doc_LAW_436110/f3008796e35445a5adad9236c1a058645dc1fc4a/; https://www.consultant.ru/document/cons_doc_LAW_436110/4a2a63d890bdf41696c2c210ccc50ca55aacfa15/ (дата обращения: 16.04.2026).</w:t>
+        <w:t xml:space="preserve">Федеральный закон от 29.12.2022 N 572-ФЗ. Ст. 4, ч. 2-5; ст. 9, ч. 3; ст. 10, ч. 2-4; ст. 26. Официальное опубликование: N 0001202212290024. URL: https://publication.pravo.gov.ru/Document/View/0001202212290024 (дата обращения: 16.04.2026).</w:t>
       </w:r>
     </w:p>
   </w:footnote>
@@ -6857,7 +6857,7 @@
         <w:t xml:space="preserve"> </w:t>
       </w:r>
       <w:r>
-        <w:t xml:space="preserve">Федеральный закон от 29.12.2022 N 572-ФЗ. Ст. 15, ч. 1-3. URL: https://www.consultant.ru/document/cons_doc_LAW_436110/b599780118c89e6e1fba4fb8a98aa3e77fb72fcc/ (дата обращения: 16.04.2026).</w:t>
+        <w:t xml:space="preserve">Федеральный закон от 29.12.2022 N 572-ФЗ. Ст. 15, ч. 1-3. Официальное опубликование: N 0001202212290024. URL: https://publication.pravo.gov.ru/Document/View/0001202212290024 (дата обращения: 16.04.2026).</w:t>
       </w:r>
     </w:p>
   </w:footnote>
@@ -7056,7 +7056,7 @@
         <w:t xml:space="preserve"> </w:t>
       </w:r>
       <w:r>
-        <w:t xml:space="preserve">Федеральный закон от 29.12.2022 N 572-ФЗ. Ст. 15, ч. 1-3. URL: https://www.consultant.ru/document/cons_doc_LAW_436110/b599780118c89e6e1fba4fb8a98aa3e77fb72fcc/ (дата обращения: 16.04.2026).</w:t>
+        <w:t xml:space="preserve">Федеральный закон от 29.12.2022 N 572-ФЗ. Ст. 15, ч. 1-3. Официальное опубликование: N 0001202212290024. URL: https://publication.pravo.gov.ru/Document/View/0001202212290024 (дата обращения: 16.04.2026).</w:t>
       </w:r>
     </w:p>
   </w:footnote>
@@ -7094,7 +7094,7 @@
         <w:t xml:space="preserve"> </w:t>
       </w:r>
       <w:r>
-        <w:t xml:space="preserve">Федеральный закон от 29.12.2022 N 572-ФЗ. Ст. 15, ч. 1-3. URL: https://www.consultant.ru/document/cons_doc_LAW_436110/b599780118c89e6e1fba4fb8a98aa3e77fb72fcc/ (дата обращения: 16.04.2026).</w:t>
+        <w:t xml:space="preserve">Федеральный закон от 29.12.2022 N 572-ФЗ. Ст. 15, ч. 1-3. Официальное опубликование: N 0001202212290024. URL: https://publication.pravo.gov.ru/Document/View/0001202212290024 (дата обращения: 16.04.2026).</w:t>
       </w:r>
     </w:p>
   </w:footnote>
@@ -7132,7 +7132,7 @@
         <w:t xml:space="preserve"> </w:t>
       </w:r>
       <w:r>
-        <w:t xml:space="preserve">Федеральный закон от 29.12.2022 N 572-ФЗ. Ст. 15, ч. 1-3. URL: https://www.consultant.ru/document/cons_doc_LAW_436110/b599780118c89e6e1fba4fb8a98aa3e77fb72fcc/ (дата обращения: 16.04.2026).</w:t>
+        <w:t xml:space="preserve">Федеральный закон от 29.12.2022 N 572-ФЗ. Ст. 15, ч. 1-3. Официальное опубликование: N 0001202212290024. URL: https://publication.pravo.gov.ru/Document/View/0001202212290024 (дата обращения: 16.04.2026).</w:t>
       </w:r>
     </w:p>
   </w:footnote>
@@ -7151,7 +7151,7 @@
         <w:t xml:space="preserve"> </w:t>
       </w:r>
       <w:r>
-        <w:t xml:space="preserve">Федеральный закон от 29.12.2022 N 572-ФЗ. Ст. 4, ч. 1-13; ст. 9, ч. 3-5; ст. 10, ч. 1-6. URL: https://www.consultant.ru/document/cons_doc_LAW_436110/10aee05e12277c35818b46632ac3c9dd2d327657/; https://www.consultant.ru/document/cons_doc_LAW_436110/eb49e4b6b3961c97b3a6a669352f5e911234ccf1/; https://www.consultant.ru/document/cons_doc_LAW_436110/f3008796e35445a5adad9236c1a058645dc1fc4a/ (дата обращения: 16.04.2026).</w:t>
+        <w:t xml:space="preserve">Федеральный закон от 29.12.2022 N 572-ФЗ. Ст. 4, ч. 1-13; ст. 9, ч. 3-5; ст. 10, ч. 1-6. Официальное опубликование: N 0001202212290024. URL: https://publication.pravo.gov.ru/Document/View/0001202212290024 (дата обращения: 16.04.2026).</w:t>
       </w:r>
     </w:p>
   </w:footnote>
@@ -7201,7 +7201,7 @@
         <w:t xml:space="preserve"> </w:t>
       </w:r>
       <w:r>
-        <w:t xml:space="preserve">Федеральный закон от 29.12.2022 N 572-ФЗ. Ст. 3, ч. 14-18. URL: https://www.consultant.ru/document/cons_doc_LAW_436110/15f0efd3c8311b53608abd85f9c02157e1457f55/ (дата обращения: 16.04.2026).</w:t>
+        <w:t xml:space="preserve">Федеральный закон от 29.12.2022 N 572-ФЗ. Ст. 3, ч. 14-18. Официальное опубликование: N 0001202212290024. URL: https://publication.pravo.gov.ru/Document/View/0001202212290024 (дата обращения: 16.04.2026).</w:t>
       </w:r>
     </w:p>
   </w:footnote>
@@ -7248,7 +7248,7 @@
         <w:t xml:space="preserve">“О персональных данных”</w:t>
       </w:r>
       <w:r>
-        <w:t xml:space="preserve">. Ст. 9 (в ред. от 24.06.2025). URL: https://www.consultant.ru/document/cons_doc_LAW_61801/6c94959bc017ac80140621762d2ac59f6006b08c/ (дата обращения: 16.04.2026).</w:t>
+        <w:t xml:space="preserve">. Ст. 9 (в ред. от 24.06.2025). URL: https://pravo.gov.ru/proxy/ips/?docbody=&amp;link_id=0&amp;nd=102108261&amp;intelsearch=&amp;firstDoc=1 (дата обращения: 16.04.2026).</w:t>
       </w:r>
     </w:p>
   </w:footnote>
@@ -7286,7 +7286,7 @@
         <w:t xml:space="preserve"> </w:t>
       </w:r>
       <w:r>
-        <w:t xml:space="preserve">Федеральный закон от 29.12.2022 N 572-ФЗ. Ст. 3, ч. 14-18. URL: https://www.consultant.ru/document/cons_doc_LAW_436110/15f0efd3c8311b53608abd85f9c02157e1457f55/ (дата обращения: 16.04.2026).</w:t>
+        <w:t xml:space="preserve">Федеральный закон от 29.12.2022 N 572-ФЗ. Ст. 3, ч. 14-18. Официальное опубликование: N 0001202212290024. URL: https://publication.pravo.gov.ru/Document/View/0001202212290024 (дата обращения: 16.04.2026).</w:t>
       </w:r>
     </w:p>
   </w:footnote>
@@ -7513,7 +7513,7 @@
         <w:t xml:space="preserve"> </w:t>
       </w:r>
       <w:r>
-        <w:t xml:space="preserve">Федеральный закон от 29.12.2022 N 572-ФЗ. Ст. 15, ч. 1-3. URL: https://www.consultant.ru/document/cons_doc_LAW_436110/b599780118c89e6e1fba4fb8a98aa3e77fb72fcc/ (дата обращения: 16.04.2026).</w:t>
+        <w:t xml:space="preserve">Федеральный закон от 29.12.2022 N 572-ФЗ. Ст. 15, ч. 1-3. Официальное опубликование: N 0001202212290024. URL: https://publication.pravo.gov.ru/Document/View/0001202212290024 (дата обращения: 16.04.2026).</w:t>
       </w:r>
     </w:p>
   </w:footnote>
@@ -7579,7 +7579,7 @@
         <w:t xml:space="preserve">“По делу о проверке конституционности пункта 8 части 1 статьи 6 Федерального закона «О персональных данных» в связи с жалобой общества с ограниченной ответственностью «МедРейтинг»”</w:t>
       </w:r>
       <w:r>
-        <w:t xml:space="preserve">. Официальное опубликование: N 0001202105280003. URL: https://publication.pravo.gov.ru/Document/View/0001202105280003; дублирующий текст акта: https://www.consultant.ru/document/cons_doc_LAW_385041/ (дата обращения: 16.04.2026).</w:t>
+        <w:t xml:space="preserve">. Официальное опубликование: N 0001202105280003. URL: https://publication.pravo.gov.ru/Document/View/0001202105280003 (дата обращения: 16.04.2026).</w:t>
       </w:r>
     </w:p>
   </w:footnote>
@@ -7664,7 +7664,7 @@
         <w:t xml:space="preserve">“По делу о проверке конституционности пункта 8 части 1 статьи 6 Федерального закона «О персональных данных» в связи с жалобой общества с ограниченной ответственностью «МедРейтинг»”</w:t>
       </w:r>
       <w:r>
-        <w:t xml:space="preserve">. Официальное опубликование: N 0001202105280003. URL: https://publication.pravo.gov.ru/Document/View/0001202105280003; дублирующий текст акта: https://www.consultant.ru/document/cons_doc_LAW_385041/ (дата обращения: 16.04.2026).</w:t>
+        <w:t xml:space="preserve">. Официальное опубликование: N 0001202105280003. URL: https://publication.pravo.gov.ru/Document/View/0001202105280003 (дата обращения: 16.04.2026).</w:t>
       </w:r>
     </w:p>
   </w:footnote>
@@ -7692,7 +7692,7 @@
         <w:t xml:space="preserve">“По делу о проверке конституционности пункта 8 части 1 статьи 6 Федерального закона «О персональных данных» в связи с жалобой общества с ограниченной ответственностью «МедРейтинг»”</w:t>
       </w:r>
       <w:r>
-        <w:t xml:space="preserve">. Официальное опубликование: N 0001202105280003. URL: https://publication.pravo.gov.ru/Document/View/0001202105280003; дублирующий текст акта: https://www.consultant.ru/document/cons_doc_LAW_385041/ (дата обращения: 16.04.2026).</w:t>
+        <w:t xml:space="preserve">. Официальное опубликование: N 0001202105280003. URL: https://publication.pravo.gov.ru/Document/View/0001202105280003 (дата обращения: 16.04.2026).</w:t>
       </w:r>
     </w:p>
   </w:footnote>
@@ -7748,7 +7748,7 @@
         <w:t xml:space="preserve">“О персональных данных”</w:t>
       </w:r>
       <w:r>
-        <w:t xml:space="preserve">. Ст. 9 (в ред. от 24.06.2025). URL: https://www.consultant.ru/document/cons_doc_LAW_61801/6c94959bc017ac80140621762d2ac59f6006b08c/ (дата обращения: 16.04.2026).</w:t>
+        <w:t xml:space="preserve">. Ст. 9 (в ред. от 24.06.2025). URL: https://pravo.gov.ru/proxy/ips/?docbody=&amp;link_id=0&amp;nd=102108261&amp;intelsearch=&amp;firstDoc=1 (дата обращения: 16.04.2026).</w:t>
       </w:r>
     </w:p>
   </w:footnote>
@@ -7986,7 +7986,7 @@
         <w:t xml:space="preserve"> </w:t>
       </w:r>
       <w:r>
-        <w:t xml:space="preserve">Федеральный закон от 29.12.2022 N 572-ФЗ. Ст. 3, ч. 14-18. URL: https://www.consultant.ru/document/cons_doc_LAW_436110/15f0efd3c8311b53608abd85f9c02157e1457f55/ (дата обращения: 16.04.2026).</w:t>
+        <w:t xml:space="preserve">Федеральный закон от 29.12.2022 N 572-ФЗ. Ст. 3, ч. 14-18. Официальное опубликование: N 0001202212290024. URL: https://publication.pravo.gov.ru/Document/View/0001202212290024 (дата обращения: 16.04.2026).</w:t>
       </w:r>
     </w:p>
   </w:footnote>
@@ -8052,7 +8052,7 @@
         <w:t xml:space="preserve">“По делу о проверке конституционности пункта 8 части 1 статьи 6 Федерального закона «О персональных данных» в связи с жалобой общества с ограниченной ответственностью «МедРейтинг»”</w:t>
       </w:r>
       <w:r>
-        <w:t xml:space="preserve">. Официальное опубликование: N 0001202105280003. URL: https://publication.pravo.gov.ru/Document/View/0001202105280003; дублирующий текст акта: https://www.consultant.ru/document/cons_doc_LAW_385041/ (дата обращения: 16.04.2026).</w:t>
+        <w:t xml:space="preserve">. Официальное опубликование: N 0001202105280003. URL: https://publication.pravo.gov.ru/Document/View/0001202105280003 (дата обращения: 16.04.2026).</w:t>
       </w:r>
     </w:p>
   </w:footnote>
@@ -8439,7 +8439,7 @@
         <w:t xml:space="preserve"> </w:t>
       </w:r>
       <w:r>
-        <w:t xml:space="preserve">(ред. от 24.06.2025). Ст. 11, 16, 23, 23.1. URL: https://www.consultant.ru/document/cons_doc_LAW_61801/; ст. 11: https://www.consultant.ru/document/cons_doc_LAW_61801/7336c78762a98b5f4f698b8c3800dca1111acc16/ (дата обращения: 16.04.2026).</w:t>
+        <w:t xml:space="preserve">(ред. от 24.06.2025). Ст. 11, 16, 23, 23.1. URL: https://pravo.gov.ru/proxy/ips/?docbody=&amp;link_id=0&amp;nd=102108261&amp;intelsearch=&amp;firstDoc=1 (дата обращения: 16.04.2026).</w:t>
       </w:r>
     </w:p>
   </w:footnote>
@@ -8470,7 +8470,7 @@
         <w:t xml:space="preserve"> </w:t>
       </w:r>
       <w:r>
-        <w:t xml:space="preserve">(ред. от 28.12.2024). Ст. 3, ч. 1-8, 11-13, 18-22. URL: https://www.consultant.ru/document/cons_doc_LAW_436110/; ст. 3: https://www.consultant.ru/document/cons_doc_LAW_436110/15f0efd3c8311b53608abd85f9c02157e1457f55/ (дата обращения: 16.04.2026).</w:t>
+        <w:t xml:space="preserve">(ред. от 28.12.2024). Ст. 3, ч. 1-8, 11-13, 18-22. Официальное опубликование: N 0001202212290024; действующая редакция перепроверена по официальному интернет-порталу правовой информации на 16.04.2026. URL: https://publication.pravo.gov.ru/Document/View/0001202212290024 (дата обращения: 16.04.2026).</w:t>
       </w:r>
     </w:p>
   </w:footnote>
@@ -8532,7 +8532,7 @@
         <w:t xml:space="preserve"> </w:t>
       </w:r>
       <w:r>
-        <w:t xml:space="preserve">(ред. от 24.06.2025). Ст. 11, 16, 23, 23.1. URL: https://www.consultant.ru/document/cons_doc_LAW_61801/; ст. 11: https://www.consultant.ru/document/cons_doc_LAW_61801/7336c78762a98b5f4f698b8c3800dca1111acc16/ (дата обращения: 16.04.2026).</w:t>
+        <w:t xml:space="preserve">(ред. от 24.06.2025). Ст. 11, 16, 23, 23.1. URL: https://pravo.gov.ru/proxy/ips/?docbody=&amp;link_id=0&amp;nd=102108261&amp;intelsearch=&amp;firstDoc=1 (дата обращения: 16.04.2026).</w:t>
       </w:r>
     </w:p>
   </w:footnote>
@@ -8563,7 +8563,7 @@
         <w:t xml:space="preserve"> </w:t>
       </w:r>
       <w:r>
-        <w:t xml:space="preserve">(ред. от 28.12.2024). Ст. 3, ч. 1-8, 11-13, 18-22. URL: https://www.consultant.ru/document/cons_doc_LAW_436110/; ст. 3: https://www.consultant.ru/document/cons_doc_LAW_436110/15f0efd3c8311b53608abd85f9c02157e1457f55/ (дата обращения: 16.04.2026).</w:t>
+        <w:t xml:space="preserve">(ред. от 28.12.2024). Ст. 3, ч. 1-8, 11-13, 18-22. Официальное опубликование: N 0001202212290024; действующая редакция перепроверена по официальному интернет-порталу правовой информации на 16.04.2026. URL: https://publication.pravo.gov.ru/Document/View/0001202212290024 (дата обращения: 16.04.2026).</w:t>
       </w:r>
     </w:p>
   </w:footnote>
@@ -8639,7 +8639,7 @@
         <w:t xml:space="preserve"> </w:t>
       </w:r>
       <w:r>
-        <w:t xml:space="preserve">(ред. от 24.06.2025). Ст. 11, 16, 23, 23.1. URL: https://www.consultant.ru/document/cons_doc_LAW_61801/; ст. 11: https://www.consultant.ru/document/cons_doc_LAW_61801/7336c78762a98b5f4f698b8c3800dca1111acc16/ (дата обращения: 16.04.2026).</w:t>
+        <w:t xml:space="preserve">(ред. от 24.06.2025). Ст. 11, 16, 23, 23.1. URL: https://pravo.gov.ru/proxy/ips/?docbody=&amp;link_id=0&amp;nd=102108261&amp;intelsearch=&amp;firstDoc=1 (дата обращения: 16.04.2026).</w:t>
       </w:r>
     </w:p>
   </w:footnote>
@@ -8703,7 +8703,7 @@
         <w:t xml:space="preserve"> </w:t>
       </w:r>
       <w:r>
-        <w:t xml:space="preserve">Федеральный закон от 29.12.2022 N 572-ФЗ. Ст. 15. URL: https://www.consultant.ru/document/cons_doc_LAW_436110/b599780118c89e6e1fba4fb8a98aa3e77fb72fcc/ (дата обращения: 16.04.2026).</w:t>
+        <w:t xml:space="preserve">Федеральный закон от 29.12.2022 N 572-ФЗ. Ст. 15. Официальное опубликование: N 0001202212290024. URL: https://publication.pravo.gov.ru/Document/View/0001202212290024 (дата обращения: 16.04.2026).</w:t>
       </w:r>
     </w:p>
   </w:footnote>
@@ -8819,7 +8819,7 @@
         <w:t xml:space="preserve"> </w:t>
       </w:r>
       <w:r>
-        <w:t xml:space="preserve">(ред. от 24.06.2025). Ст. 11, 16, 23, 23.1. URL: https://www.consultant.ru/document/cons_doc_LAW_61801/; ст. 11: https://www.consultant.ru/document/cons_doc_LAW_61801/7336c78762a98b5f4f698b8c3800dca1111acc16/ (дата обращения: 16.04.2026).</w:t>
+        <w:t xml:space="preserve">(ред. от 24.06.2025). Ст. 11, 16, 23, 23.1. URL: https://pravo.gov.ru/proxy/ips/?docbody=&amp;link_id=0&amp;nd=102108261&amp;intelsearch=&amp;firstDoc=1 (дата обращения: 16.04.2026).</w:t>
       </w:r>
     </w:p>
   </w:footnote>
@@ -8927,7 +8927,7 @@
         <w:t xml:space="preserve"> </w:t>
       </w:r>
       <w:r>
-        <w:t xml:space="preserve">(ред. от 28.12.2024). Ст. 3, ч. 1-8, 11-13, 18-22. URL: https://www.consultant.ru/document/cons_doc_LAW_436110/; ст. 3: https://www.consultant.ru/document/cons_doc_LAW_436110/15f0efd3c8311b53608abd85f9c02157e1457f55/ (дата обращения: 16.04.2026).</w:t>
+        <w:t xml:space="preserve">(ред. от 28.12.2024). Ст. 3, ч. 1-8, 11-13, 18-22. Официальное опубликование: N 0001202212290024; действующая редакция перепроверена по официальному интернет-порталу правовой информации на 16.04.2026. URL: https://publication.pravo.gov.ru/Document/View/0001202212290024 (дата обращения: 16.04.2026).</w:t>
       </w:r>
     </w:p>
   </w:footnote>

</xml_diff>